<commit_message>
Database connector: fully automatic feed from the trading system
- tools/lsm_db_feeder.py: reads prices and index directly from the trading
  system database (SQL Server/ODBC, Oracle, PostgreSQL, MySQL, SQLite)
  with a read-only account; reuses build_session matching/validation
- Session-aware scheduler (trading days, pre/post windows, holidays),
  heartbeat writes, reconnect with last-good data, closing snapshot and
  daily archive, holiday closed status, status file and rotating log
- E-mail alerts on outage, recovery and reconciliation differences
- Read-only guard rejects anything but a single SELECT
- db_feeder.ini template, docs/db SQL view/account templates for DBA,
  data/holidays.json, demo SQLite generator for training
- Windows: start/test/install-task batch files; CI runs all tests
- Docs: DEPLOYMENT.md section 11 and Word guide appendix B

Co-Authored-By: Claude Opus 5.5 <noreply@anthropic.com>
Claude-Session: https://claude.ai/code/session_01QStz6pAXGL6bMRicgD7N8u
</commit_message>
<xml_diff>
--- a/lsm-display-cpp/docs/دليل-تركيب-وتشغيل-شاشة-الأسهم.docx
+++ b/lsm-display-cpp/docs/دليل-تركيب-وتشغيل-شاشة-الأسهم.docx
@@ -256,7 +256,7 @@
                 <w:szCs w:val="20"/>
                 <w:rtl/>
               </w:rPr>
-              <w:t xml:space="preserve">1.3</w:t>
+              <w:t xml:space="preserve">1.4</w:t>
             </w:r>
           </w:p>
         </w:tc>
@@ -14506,6 +14506,2226 @@
         <w:t xml:space="preserve"> بينما المؤشر انخفض 0.39%؛ أغلب الفرق من المصرف التجاري الوطني (−6.19%).</w:t>
       </w:r>
     </w:p>
+    <w:p>
+      <w:r>
+        <w:br w:type="page"/>
+      </w:r>
+    </w:p>
+    <w:p>
+      <w:pPr>
+        <w:pStyle w:val="Heading1"/>
+        <w:keepNext/>
+        <w:pBdr>
+          <w:bottom w:val="single" w:color="C9A961" w:sz="8" w:space="4"/>
+        </w:pBdr>
+        <w:bidi/>
+        <w:spacing w:after="160" w:before="360"/>
+      </w:pPr>
+      <w:r>
+        <w:rPr>
+          <w:rFonts w:ascii="Arial" w:cs="Arial" w:hAnsi="Arial"/>
+          <w:b/>
+          <w:bCs/>
+          <w:color w:val="1E2761"/>
+          <w:sz w:val="32"/>
+          <w:szCs w:val="32"/>
+          <w:rtl/>
+        </w:rPr>
+        <w:t xml:space="preserve">ملحق ب: التغذية المباشرة من قاعدة البيانات (تشغيل دون أي تدخل)</w:t>
+      </w:r>
+    </w:p>
+    <w:p>
+      <w:pPr>
+        <w:bidi/>
+        <w:spacing w:after="120" w:before="0" w:line="300"/>
+      </w:pPr>
+      <w:r>
+        <w:rPr>
+          <w:rFonts w:ascii="Arial" w:cs="Arial" w:hAnsi="Arial"/>
+          <w:sz w:val="22"/>
+          <w:szCs w:val="22"/>
+          <w:rtl/>
+        </w:rPr>
+        <w:t xml:space="preserve">بدل انتظار حفظ التقرير، تقرأ وحدة الربط </w:t>
+      </w:r>
+      <w:r>
+        <w:rPr>
+          <w:rFonts w:ascii="Arial" w:cs="Arial" w:hAnsi="Arial"/>
+          <w:b/>
+          <w:bCs/>
+          <w:sz w:val="22"/>
+          <w:szCs w:val="22"/>
+          <w:rtl/>
+        </w:rPr>
+        <w:t xml:space="preserve">lsm_db_feeder.py</w:t>
+      </w:r>
+      <w:r>
+        <w:rPr>
+          <w:rFonts w:ascii="Arial" w:cs="Arial" w:hAnsi="Arial"/>
+          <w:sz w:val="22"/>
+          <w:szCs w:val="22"/>
+          <w:rtl/>
+        </w:rPr>
+        <w:t xml:space="preserve"> الأسعار مباشرة من قاعدة بيانات نظام التداول كل 15 ثانية أثناء الجلسة، بحساب للقراءة فقط، وتمرّرها على نفس منطق المطابقة والتحقق، فتتحدث الشاشة دون أي إجراء من الموظفين.</w:t>
+      </w:r>
+    </w:p>
+    <w:p>
+      <w:pPr>
+        <w:pStyle w:val="Heading2"/>
+        <w:keepNext/>
+        <w:bidi/>
+        <w:spacing w:after="120" w:before="240"/>
+      </w:pPr>
+      <w:r>
+        <w:rPr>
+          <w:rFonts w:ascii="Arial" w:cs="Arial" w:hAnsi="Arial"/>
+          <w:b/>
+          <w:bCs/>
+          <w:color w:val="1E2761"/>
+          <w:sz w:val="26"/>
+          <w:szCs w:val="26"/>
+          <w:rtl/>
+        </w:rPr>
+        <w:t xml:space="preserve">ما يحدث آليًا</w:t>
+      </w:r>
+    </w:p>
+    <w:tbl>
+      <w:tblPr>
+        <w:bidiVisual/>
+        <w:tblW w:type="dxa" w:w="9026"/>
+        <w:tblBorders>
+          <w:top w:val="single" w:color="auto" w:sz="4"/>
+          <w:left w:val="single" w:color="auto" w:sz="4"/>
+          <w:bottom w:val="single" w:color="auto" w:sz="4"/>
+          <w:right w:val="single" w:color="auto" w:sz="4"/>
+          <w:insideH w:val="single" w:color="auto" w:sz="4"/>
+          <w:insideV w:val="single" w:color="auto" w:sz="4"/>
+        </w:tblBorders>
+      </w:tblPr>
+      <w:tblGrid>
+        <w:gridCol w:w="3000"/>
+        <w:gridCol w:w="6026"/>
+      </w:tblGrid>
+      <w:tr>
+        <w:trPr>
+          <w:tblHeader/>
+        </w:trPr>
+        <w:tc>
+          <w:tcPr>
+            <w:tcW w:type="dxa" w:w="3000"/>
+            <w:tcBorders>
+              <w:top w:val="single" w:color="C9CEDF" w:sz="4"/>
+              <w:left w:val="single" w:color="C9CEDF" w:sz="4"/>
+              <w:bottom w:val="single" w:color="C9CEDF" w:sz="4"/>
+              <w:right w:val="single" w:color="C9CEDF" w:sz="4"/>
+            </w:tcBorders>
+            <w:shd w:fill="1E2761" w:color="auto" w:val="clear"/>
+            <w:tcMar>
+              <w:top w:type="dxa" w:w="70"/>
+              <w:left w:type="dxa" w:w="110"/>
+              <w:bottom w:type="dxa" w:w="70"/>
+              <w:right w:type="dxa" w:w="110"/>
+            </w:tcMar>
+            <w:vAlign w:val="center"/>
+          </w:tcPr>
+          <w:p>
+            <w:pPr>
+              <w:bidi/>
+              <w:spacing w:after="0" w:line="276"/>
+            </w:pPr>
+            <w:r>
+              <w:rPr>
+                <w:rFonts w:ascii="Arial" w:cs="Arial" w:hAnsi="Arial"/>
+                <w:b/>
+                <w:bCs/>
+                <w:color w:val="FFFFFF"/>
+                <w:sz w:val="20"/>
+                <w:szCs w:val="20"/>
+                <w:rtl/>
+              </w:rPr>
+              <w:t xml:space="preserve">الوقت / الحالة</w:t>
+            </w:r>
+          </w:p>
+        </w:tc>
+        <w:tc>
+          <w:tcPr>
+            <w:tcW w:type="dxa" w:w="6026"/>
+            <w:tcBorders>
+              <w:top w:val="single" w:color="C9CEDF" w:sz="4"/>
+              <w:left w:val="single" w:color="C9CEDF" w:sz="4"/>
+              <w:bottom w:val="single" w:color="C9CEDF" w:sz="4"/>
+              <w:right w:val="single" w:color="C9CEDF" w:sz="4"/>
+            </w:tcBorders>
+            <w:shd w:fill="1E2761" w:color="auto" w:val="clear"/>
+            <w:tcMar>
+              <w:top w:type="dxa" w:w="70"/>
+              <w:left w:type="dxa" w:w="110"/>
+              <w:bottom w:type="dxa" w:w="70"/>
+              <w:right w:type="dxa" w:w="110"/>
+            </w:tcMar>
+            <w:vAlign w:val="center"/>
+          </w:tcPr>
+          <w:p>
+            <w:pPr>
+              <w:bidi/>
+              <w:spacing w:after="0" w:line="276"/>
+            </w:pPr>
+            <w:r>
+              <w:rPr>
+                <w:rFonts w:ascii="Arial" w:cs="Arial" w:hAnsi="Arial"/>
+                <w:b/>
+                <w:bCs/>
+                <w:color w:val="FFFFFF"/>
+                <w:sz w:val="20"/>
+                <w:szCs w:val="20"/>
+                <w:rtl/>
+              </w:rPr>
+              <w:t xml:space="preserve">ما تفعله الوحدة</w:t>
+            </w:r>
+          </w:p>
+        </w:tc>
+      </w:tr>
+      <w:tr>
+        <w:trPr>
+          <w:cantSplit/>
+        </w:trPr>
+        <w:tc>
+          <w:tcPr>
+            <w:tcW w:type="dxa" w:w="3000"/>
+            <w:tcBorders>
+              <w:top w:val="single" w:color="C9CEDF" w:sz="4"/>
+              <w:left w:val="single" w:color="C9CEDF" w:sz="4"/>
+              <w:bottom w:val="single" w:color="C9CEDF" w:sz="4"/>
+              <w:right w:val="single" w:color="C9CEDF" w:sz="4"/>
+            </w:tcBorders>
+            <w:shd w:fill="FFFFFF" w:color="auto" w:val="clear"/>
+            <w:tcMar>
+              <w:top w:type="dxa" w:w="70"/>
+              <w:left w:type="dxa" w:w="110"/>
+              <w:bottom w:type="dxa" w:w="70"/>
+              <w:right w:type="dxa" w:w="110"/>
+            </w:tcMar>
+            <w:vAlign w:val="center"/>
+          </w:tcPr>
+          <w:p>
+            <w:pPr>
+              <w:bidi/>
+              <w:spacing w:after="0" w:line="276"/>
+            </w:pPr>
+            <w:r>
+              <w:rPr>
+                <w:rFonts w:ascii="Arial" w:cs="Arial" w:hAnsi="Arial"/>
+                <w:b w:val="false"/>
+                <w:sz w:val="20"/>
+                <w:szCs w:val="20"/>
+                <w:rtl/>
+              </w:rPr>
+              <w:t xml:space="preserve">قبل الافتتاح بـ 15 دقيقة</w:t>
+            </w:r>
+          </w:p>
+        </w:tc>
+        <w:tc>
+          <w:tcPr>
+            <w:tcW w:type="dxa" w:w="6026"/>
+            <w:tcBorders>
+              <w:top w:val="single" w:color="C9CEDF" w:sz="4"/>
+              <w:left w:val="single" w:color="C9CEDF" w:sz="4"/>
+              <w:bottom w:val="single" w:color="C9CEDF" w:sz="4"/>
+              <w:right w:val="single" w:color="C9CEDF" w:sz="4"/>
+            </w:tcBorders>
+            <w:shd w:fill="FFFFFF" w:color="auto" w:val="clear"/>
+            <w:tcMar>
+              <w:top w:type="dxa" w:w="70"/>
+              <w:left w:type="dxa" w:w="110"/>
+              <w:bottom w:type="dxa" w:w="70"/>
+              <w:right w:type="dxa" w:w="110"/>
+            </w:tcMar>
+            <w:vAlign w:val="center"/>
+          </w:tcPr>
+          <w:p>
+            <w:pPr>
+              <w:bidi/>
+              <w:spacing w:after="0" w:line="276"/>
+            </w:pPr>
+            <w:r>
+              <w:rPr>
+                <w:rFonts w:ascii="Arial" w:cs="Arial" w:hAnsi="Arial"/>
+                <w:b w:val="false"/>
+                <w:sz w:val="20"/>
+                <w:szCs w:val="20"/>
+                <w:rtl/>
+              </w:rPr>
+              <w:t xml:space="preserve">تبدأ القراءة من قاعدة البيانات</w:t>
+            </w:r>
+          </w:p>
+        </w:tc>
+      </w:tr>
+      <w:tr>
+        <w:trPr>
+          <w:cantSplit/>
+        </w:trPr>
+        <w:tc>
+          <w:tcPr>
+            <w:tcW w:type="dxa" w:w="3000"/>
+            <w:tcBorders>
+              <w:top w:val="single" w:color="C9CEDF" w:sz="4"/>
+              <w:left w:val="single" w:color="C9CEDF" w:sz="4"/>
+              <w:bottom w:val="single" w:color="C9CEDF" w:sz="4"/>
+              <w:right w:val="single" w:color="C9CEDF" w:sz="4"/>
+            </w:tcBorders>
+            <w:shd w:fill="F6F7FB" w:color="auto" w:val="clear"/>
+            <w:tcMar>
+              <w:top w:type="dxa" w:w="70"/>
+              <w:left w:type="dxa" w:w="110"/>
+              <w:bottom w:type="dxa" w:w="70"/>
+              <w:right w:type="dxa" w:w="110"/>
+            </w:tcMar>
+            <w:vAlign w:val="center"/>
+          </w:tcPr>
+          <w:p>
+            <w:pPr>
+              <w:bidi/>
+              <w:spacing w:after="0" w:line="276"/>
+            </w:pPr>
+            <w:r>
+              <w:rPr>
+                <w:rFonts w:ascii="Arial" w:cs="Arial" w:hAnsi="Arial"/>
+                <w:b w:val="false"/>
+                <w:sz w:val="20"/>
+                <w:szCs w:val="20"/>
+                <w:rtl/>
+              </w:rPr>
+              <w:t xml:space="preserve">أثناء الجلسة</w:t>
+            </w:r>
+          </w:p>
+        </w:tc>
+        <w:tc>
+          <w:tcPr>
+            <w:tcW w:type="dxa" w:w="6026"/>
+            <w:tcBorders>
+              <w:top w:val="single" w:color="C9CEDF" w:sz="4"/>
+              <w:left w:val="single" w:color="C9CEDF" w:sz="4"/>
+              <w:bottom w:val="single" w:color="C9CEDF" w:sz="4"/>
+              <w:right w:val="single" w:color="C9CEDF" w:sz="4"/>
+            </w:tcBorders>
+            <w:shd w:fill="F6F7FB" w:color="auto" w:val="clear"/>
+            <w:tcMar>
+              <w:top w:type="dxa" w:w="70"/>
+              <w:left w:type="dxa" w:w="110"/>
+              <w:bottom w:type="dxa" w:w="70"/>
+              <w:right w:type="dxa" w:w="110"/>
+            </w:tcMar>
+            <w:vAlign w:val="center"/>
+          </w:tcPr>
+          <w:p>
+            <w:pPr>
+              <w:bidi/>
+              <w:spacing w:after="0" w:line="276"/>
+            </w:pPr>
+            <w:r>
+              <w:rPr>
+                <w:rFonts w:ascii="Arial" w:cs="Arial" w:hAnsi="Arial"/>
+                <w:b w:val="false"/>
+                <w:sz w:val="20"/>
+                <w:szCs w:val="20"/>
+                <w:rtl/>
+              </w:rPr>
+              <w:t xml:space="preserve">قراءة كل 15 ثانية؛ تحديث الشاشة عند أي تغيّر، ونبضة كل 60 ثانية حتى لو لم تتغير الأرقام</w:t>
+            </w:r>
+          </w:p>
+        </w:tc>
+      </w:tr>
+      <w:tr>
+        <w:trPr>
+          <w:cantSplit/>
+        </w:trPr>
+        <w:tc>
+          <w:tcPr>
+            <w:tcW w:type="dxa" w:w="3000"/>
+            <w:tcBorders>
+              <w:top w:val="single" w:color="C9CEDF" w:sz="4"/>
+              <w:left w:val="single" w:color="C9CEDF" w:sz="4"/>
+              <w:bottom w:val="single" w:color="C9CEDF" w:sz="4"/>
+              <w:right w:val="single" w:color="C9CEDF" w:sz="4"/>
+            </w:tcBorders>
+            <w:shd w:fill="FFFFFF" w:color="auto" w:val="clear"/>
+            <w:tcMar>
+              <w:top w:type="dxa" w:w="70"/>
+              <w:left w:type="dxa" w:w="110"/>
+              <w:bottom w:type="dxa" w:w="70"/>
+              <w:right w:type="dxa" w:w="110"/>
+            </w:tcMar>
+            <w:vAlign w:val="center"/>
+          </w:tcPr>
+          <w:p>
+            <w:pPr>
+              <w:bidi/>
+              <w:spacing w:after="0" w:line="276"/>
+            </w:pPr>
+            <w:r>
+              <w:rPr>
+                <w:rFonts w:ascii="Arial" w:cs="Arial" w:hAnsi="Arial"/>
+                <w:b w:val="false"/>
+                <w:sz w:val="20"/>
+                <w:szCs w:val="20"/>
+                <w:rtl/>
+              </w:rPr>
+              <w:t xml:space="preserve">بعد الإقفال بـ 30 دقيقة</w:t>
+            </w:r>
+          </w:p>
+        </w:tc>
+        <w:tc>
+          <w:tcPr>
+            <w:tcW w:type="dxa" w:w="6026"/>
+            <w:tcBorders>
+              <w:top w:val="single" w:color="C9CEDF" w:sz="4"/>
+              <w:left w:val="single" w:color="C9CEDF" w:sz="4"/>
+              <w:bottom w:val="single" w:color="C9CEDF" w:sz="4"/>
+              <w:right w:val="single" w:color="C9CEDF" w:sz="4"/>
+            </w:tcBorders>
+            <w:shd w:fill="FFFFFF" w:color="auto" w:val="clear"/>
+            <w:tcMar>
+              <w:top w:type="dxa" w:w="70"/>
+              <w:left w:type="dxa" w:w="110"/>
+              <w:bottom w:type="dxa" w:w="70"/>
+              <w:right w:type="dxa" w:w="110"/>
+            </w:tcMar>
+            <w:vAlign w:val="center"/>
+          </w:tcPr>
+          <w:p>
+            <w:pPr>
+              <w:bidi/>
+              <w:spacing w:after="0" w:line="276"/>
+            </w:pPr>
+            <w:r>
+              <w:rPr>
+                <w:rFonts w:ascii="Arial" w:cs="Arial" w:hAnsi="Arial"/>
+                <w:b w:val="false"/>
+                <w:sz w:val="20"/>
+                <w:szCs w:val="20"/>
+                <w:rtl/>
+              </w:rPr>
+              <w:t xml:space="preserve">لقطة ختامية، وأرشفة بيانات الجلسة (data\archive)، ثم سكون حتى الجلسة التالية</w:t>
+            </w:r>
+          </w:p>
+        </w:tc>
+      </w:tr>
+      <w:tr>
+        <w:trPr>
+          <w:cantSplit/>
+        </w:trPr>
+        <w:tc>
+          <w:tcPr>
+            <w:tcW w:type="dxa" w:w="3000"/>
+            <w:tcBorders>
+              <w:top w:val="single" w:color="C9CEDF" w:sz="4"/>
+              <w:left w:val="single" w:color="C9CEDF" w:sz="4"/>
+              <w:bottom w:val="single" w:color="C9CEDF" w:sz="4"/>
+              <w:right w:val="single" w:color="C9CEDF" w:sz="4"/>
+            </w:tcBorders>
+            <w:shd w:fill="F6F7FB" w:color="auto" w:val="clear"/>
+            <w:tcMar>
+              <w:top w:type="dxa" w:w="70"/>
+              <w:left w:type="dxa" w:w="110"/>
+              <w:bottom w:type="dxa" w:w="70"/>
+              <w:right w:type="dxa" w:w="110"/>
+            </w:tcMar>
+            <w:vAlign w:val="center"/>
+          </w:tcPr>
+          <w:p>
+            <w:pPr>
+              <w:bidi/>
+              <w:spacing w:after="0" w:line="276"/>
+            </w:pPr>
+            <w:r>
+              <w:rPr>
+                <w:rFonts w:ascii="Arial" w:cs="Arial" w:hAnsi="Arial"/>
+                <w:b w:val="false"/>
+                <w:sz w:val="20"/>
+                <w:szCs w:val="20"/>
+                <w:rtl/>
+              </w:rPr>
+              <w:t xml:space="preserve">الجمعة والسبت والعطل الرسمية</w:t>
+            </w:r>
+          </w:p>
+        </w:tc>
+        <w:tc>
+          <w:tcPr>
+            <w:tcW w:type="dxa" w:w="6026"/>
+            <w:tcBorders>
+              <w:top w:val="single" w:color="C9CEDF" w:sz="4"/>
+              <w:left w:val="single" w:color="C9CEDF" w:sz="4"/>
+              <w:bottom w:val="single" w:color="C9CEDF" w:sz="4"/>
+              <w:right w:val="single" w:color="C9CEDF" w:sz="4"/>
+            </w:tcBorders>
+            <w:shd w:fill="F6F7FB" w:color="auto" w:val="clear"/>
+            <w:tcMar>
+              <w:top w:type="dxa" w:w="70"/>
+              <w:left w:type="dxa" w:w="110"/>
+              <w:bottom w:type="dxa" w:w="70"/>
+              <w:right w:type="dxa" w:w="110"/>
+            </w:tcMar>
+            <w:vAlign w:val="center"/>
+          </w:tcPr>
+          <w:p>
+            <w:pPr>
+              <w:bidi/>
+              <w:spacing w:after="0" w:line="276"/>
+            </w:pPr>
+            <w:r>
+              <w:rPr>
+                <w:rFonts w:ascii="Arial" w:cs="Arial" w:hAnsi="Arial"/>
+                <w:b w:val="false"/>
+                <w:sz w:val="20"/>
+                <w:szCs w:val="20"/>
+                <w:rtl/>
+              </w:rPr>
+              <w:t xml:space="preserve">لا قراءة؛ والشاشة مثبتة على «السوق مغلق» في العطل (data\holidays.json)</w:t>
+            </w:r>
+          </w:p>
+        </w:tc>
+      </w:tr>
+      <w:tr>
+        <w:trPr>
+          <w:cantSplit/>
+        </w:trPr>
+        <w:tc>
+          <w:tcPr>
+            <w:tcW w:type="dxa" w:w="3000"/>
+            <w:tcBorders>
+              <w:top w:val="single" w:color="C9CEDF" w:sz="4"/>
+              <w:left w:val="single" w:color="C9CEDF" w:sz="4"/>
+              <w:bottom w:val="single" w:color="C9CEDF" w:sz="4"/>
+              <w:right w:val="single" w:color="C9CEDF" w:sz="4"/>
+            </w:tcBorders>
+            <w:shd w:fill="FFFFFF" w:color="auto" w:val="clear"/>
+            <w:tcMar>
+              <w:top w:type="dxa" w:w="70"/>
+              <w:left w:type="dxa" w:w="110"/>
+              <w:bottom w:type="dxa" w:w="70"/>
+              <w:right w:type="dxa" w:w="110"/>
+            </w:tcMar>
+            <w:vAlign w:val="center"/>
+          </w:tcPr>
+          <w:p>
+            <w:pPr>
+              <w:bidi/>
+              <w:spacing w:after="0" w:line="276"/>
+            </w:pPr>
+            <w:r>
+              <w:rPr>
+                <w:rFonts w:ascii="Arial" w:cs="Arial" w:hAnsi="Arial"/>
+                <w:b w:val="false"/>
+                <w:sz w:val="20"/>
+                <w:szCs w:val="20"/>
+                <w:rtl/>
+              </w:rPr>
+              <w:t xml:space="preserve">انقطاع قاعدة البيانات</w:t>
+            </w:r>
+          </w:p>
+        </w:tc>
+        <w:tc>
+          <w:tcPr>
+            <w:tcW w:type="dxa" w:w="6026"/>
+            <w:tcBorders>
+              <w:top w:val="single" w:color="C9CEDF" w:sz="4"/>
+              <w:left w:val="single" w:color="C9CEDF" w:sz="4"/>
+              <w:bottom w:val="single" w:color="C9CEDF" w:sz="4"/>
+              <w:right w:val="single" w:color="C9CEDF" w:sz="4"/>
+            </w:tcBorders>
+            <w:shd w:fill="FFFFFF" w:color="auto" w:val="clear"/>
+            <w:tcMar>
+              <w:top w:type="dxa" w:w="70"/>
+              <w:left w:type="dxa" w:w="110"/>
+              <w:bottom w:type="dxa" w:w="70"/>
+              <w:right w:type="dxa" w:w="110"/>
+            </w:tcMar>
+            <w:vAlign w:val="center"/>
+          </w:tcPr>
+          <w:p>
+            <w:pPr>
+              <w:bidi/>
+              <w:spacing w:after="0" w:line="276"/>
+            </w:pPr>
+            <w:r>
+              <w:rPr>
+                <w:rFonts w:ascii="Arial" w:cs="Arial" w:hAnsi="Arial"/>
+                <w:b w:val="false"/>
+                <w:sz w:val="20"/>
+                <w:szCs w:val="20"/>
+                <w:rtl/>
+              </w:rPr>
+              <w:t xml:space="preserve">تبقى آخر أرقام سليمة، وإعادة اتصال آلية، وتنبيه بالبريد بعد 5 دقائق، ثم رسالة عند العودة</w:t>
+            </w:r>
+          </w:p>
+        </w:tc>
+      </w:tr>
+      <w:tr>
+        <w:trPr>
+          <w:cantSplit/>
+        </w:trPr>
+        <w:tc>
+          <w:tcPr>
+            <w:tcW w:type="dxa" w:w="3000"/>
+            <w:tcBorders>
+              <w:top w:val="single" w:color="C9CEDF" w:sz="4"/>
+              <w:left w:val="single" w:color="C9CEDF" w:sz="4"/>
+              <w:bottom w:val="single" w:color="C9CEDF" w:sz="4"/>
+              <w:right w:val="single" w:color="C9CEDF" w:sz="4"/>
+            </w:tcBorders>
+            <w:shd w:fill="F6F7FB" w:color="auto" w:val="clear"/>
+            <w:tcMar>
+              <w:top w:type="dxa" w:w="70"/>
+              <w:left w:type="dxa" w:w="110"/>
+              <w:bottom w:type="dxa" w:w="70"/>
+              <w:right w:type="dxa" w:w="110"/>
+            </w:tcMar>
+            <w:vAlign w:val="center"/>
+          </w:tcPr>
+          <w:p>
+            <w:pPr>
+              <w:bidi/>
+              <w:spacing w:after="0" w:line="276"/>
+            </w:pPr>
+            <w:r>
+              <w:rPr>
+                <w:rFonts w:ascii="Arial" w:cs="Arial" w:hAnsi="Arial"/>
+                <w:b w:val="false"/>
+                <w:sz w:val="20"/>
+                <w:szCs w:val="20"/>
+                <w:rtl/>
+              </w:rPr>
+              <w:t xml:space="preserve">فروق في المطابقة</w:t>
+            </w:r>
+          </w:p>
+        </w:tc>
+        <w:tc>
+          <w:tcPr>
+            <w:tcW w:type="dxa" w:w="6026"/>
+            <w:tcBorders>
+              <w:top w:val="single" w:color="C9CEDF" w:sz="4"/>
+              <w:left w:val="single" w:color="C9CEDF" w:sz="4"/>
+              <w:bottom w:val="single" w:color="C9CEDF" w:sz="4"/>
+              <w:right w:val="single" w:color="C9CEDF" w:sz="4"/>
+            </w:tcBorders>
+            <w:shd w:fill="F6F7FB" w:color="auto" w:val="clear"/>
+            <w:tcMar>
+              <w:top w:type="dxa" w:w="70"/>
+              <w:left w:type="dxa" w:w="110"/>
+              <w:bottom w:type="dxa" w:w="70"/>
+              <w:right w:type="dxa" w:w="110"/>
+            </w:tcMar>
+            <w:vAlign w:val="center"/>
+          </w:tcPr>
+          <w:p>
+            <w:pPr>
+              <w:bidi/>
+              <w:spacing w:after="0" w:line="276"/>
+            </w:pPr>
+            <w:r>
+              <w:rPr>
+                <w:rFonts w:ascii="Arial" w:cs="Arial" w:hAnsi="Arial"/>
+                <w:b w:val="false"/>
+                <w:sz w:val="20"/>
+                <w:szCs w:val="20"/>
+                <w:rtl/>
+              </w:rPr>
+              <w:t xml:space="preserve">تنبيه بالبريد مرة واحدة يوميًا</w:t>
+            </w:r>
+          </w:p>
+        </w:tc>
+      </w:tr>
+    </w:tbl>
+    <w:p>
+      <w:pPr>
+        <w:pStyle w:val="Heading2"/>
+        <w:keepNext/>
+        <w:bidi/>
+        <w:spacing w:after="120" w:before="240"/>
+      </w:pPr>
+      <w:r>
+        <w:rPr>
+          <w:rFonts w:ascii="Arial" w:cs="Arial" w:hAnsi="Arial"/>
+          <w:b/>
+          <w:bCs/>
+          <w:color w:val="1E2761"/>
+          <w:sz w:val="26"/>
+          <w:szCs w:val="26"/>
+          <w:rtl/>
+        </w:rPr>
+        <w:t xml:space="preserve">المطلوب من مسؤول قاعدة البيانات (مرة واحدة)</w:t>
+      </w:r>
+    </w:p>
+    <w:p>
+      <w:pPr>
+        <w:pStyle w:val="ListParagraph"/>
+        <w:numPr>
+          <w:ilvl w:val="0"/>
+          <w:numId w:val="7"/>
+        </w:numPr>
+        <w:bidi/>
+        <w:spacing w:after="100" w:line="300"/>
+      </w:pPr>
+      <w:r>
+        <w:rPr>
+          <w:rFonts w:ascii="Arial" w:cs="Arial" w:hAnsi="Arial"/>
+          <w:sz w:val="22"/>
+          <w:szCs w:val="22"/>
+          <w:rtl/>
+        </w:rPr>
+        <w:t xml:space="preserve">إنشاء جدولي العرض </w:t>
+      </w:r>
+      <w:r>
+        <w:rPr>
+          <w:rFonts w:ascii="Arial" w:cs="Arial" w:hAnsi="Arial"/>
+          <w:b/>
+          <w:bCs/>
+          <w:sz w:val="22"/>
+          <w:szCs w:val="22"/>
+          <w:rtl/>
+        </w:rPr>
+        <w:t xml:space="preserve">LSM_DISPLAY_V</w:t>
+      </w:r>
+      <w:r>
+        <w:rPr>
+          <w:rFonts w:ascii="Arial" w:cs="Arial" w:hAnsi="Arial"/>
+          <w:sz w:val="22"/>
+          <w:szCs w:val="22"/>
+          <w:rtl/>
+        </w:rPr>
+        <w:t xml:space="preserve"> (الأسعار) و </w:t>
+      </w:r>
+      <w:r>
+        <w:rPr>
+          <w:rFonts w:ascii="Arial" w:cs="Arial" w:hAnsi="Arial"/>
+          <w:b/>
+          <w:bCs/>
+          <w:sz w:val="22"/>
+          <w:szCs w:val="22"/>
+          <w:rtl/>
+        </w:rPr>
+        <w:t xml:space="preserve">LSM_INDEX_V</w:t>
+      </w:r>
+      <w:r>
+        <w:rPr>
+          <w:rFonts w:ascii="Arial" w:cs="Arial" w:hAnsi="Arial"/>
+          <w:sz w:val="22"/>
+          <w:szCs w:val="22"/>
+          <w:rtl/>
+        </w:rPr>
+        <w:t xml:space="preserve"> (المؤشر) من القالب الجاهز docs\db\sqlserver.sql أو docs\db\oracle.sql، بعد استبدال أسماء الجداول الأصلية في نظام التداول.</w:t>
+      </w:r>
+    </w:p>
+    <w:p>
+      <w:pPr>
+        <w:pStyle w:val="ListParagraph"/>
+        <w:numPr>
+          <w:ilvl w:val="0"/>
+          <w:numId w:val="7"/>
+        </w:numPr>
+        <w:bidi/>
+        <w:spacing w:after="100" w:line="300"/>
+      </w:pPr>
+      <w:r>
+        <w:rPr>
+          <w:rFonts w:ascii="Arial" w:cs="Arial" w:hAnsi="Arial"/>
+          <w:sz w:val="22"/>
+          <w:szCs w:val="22"/>
+          <w:rtl/>
+        </w:rPr>
+        <w:t xml:space="preserve">إنشاء حساب </w:t>
+      </w:r>
+      <w:r>
+        <w:rPr>
+          <w:rFonts w:ascii="Arial" w:cs="Arial" w:hAnsi="Arial"/>
+          <w:b/>
+          <w:bCs/>
+          <w:sz w:val="22"/>
+          <w:szCs w:val="22"/>
+          <w:rtl/>
+        </w:rPr>
+        <w:t xml:space="preserve">للقراءة فقط</w:t>
+      </w:r>
+      <w:r>
+        <w:rPr>
+          <w:rFonts w:ascii="Arial" w:cs="Arial" w:hAnsi="Arial"/>
+          <w:sz w:val="22"/>
+          <w:szCs w:val="22"/>
+          <w:rtl/>
+        </w:rPr>
+        <w:t xml:space="preserve"> لا يرى إلا جدولي العرض (الأوامر جاهزة في القالب).</w:t>
+      </w:r>
+    </w:p>
+    <w:p>
+      <w:pPr>
+        <w:pStyle w:val="ListParagraph"/>
+        <w:numPr>
+          <w:ilvl w:val="0"/>
+          <w:numId w:val="7"/>
+        </w:numPr>
+        <w:bidi/>
+        <w:spacing w:after="100" w:line="300"/>
+      </w:pPr>
+      <w:r>
+        <w:rPr>
+          <w:rFonts w:ascii="Arial" w:cs="Arial" w:hAnsi="Arial"/>
+          <w:sz w:val="22"/>
+          <w:szCs w:val="22"/>
+          <w:rtl/>
+        </w:rPr>
+        <w:t xml:space="preserve">فتح منفذ القاعدة في الجدار الناري (1433 لـ SQL Server أو 1521 لـ Oracle) </w:t>
+      </w:r>
+      <w:r>
+        <w:rPr>
+          <w:rFonts w:ascii="Arial" w:cs="Arial" w:hAnsi="Arial"/>
+          <w:b/>
+          <w:bCs/>
+          <w:sz w:val="22"/>
+          <w:szCs w:val="22"/>
+          <w:rtl/>
+        </w:rPr>
+        <w:t xml:space="preserve">من جهاز الشاشة فقط إلى خادم القاعدة فقط</w:t>
+      </w:r>
+      <w:r>
+        <w:rPr>
+          <w:rFonts w:ascii="Arial" w:cs="Arial" w:hAnsi="Arial"/>
+          <w:sz w:val="22"/>
+          <w:szCs w:val="22"/>
+          <w:rtl/>
+        </w:rPr>
+        <w:t xml:space="preserve">.</w:t>
+      </w:r>
+    </w:p>
+    <w:p>
+      <w:pPr>
+        <w:pStyle w:val="Heading2"/>
+        <w:keepNext/>
+        <w:bidi/>
+        <w:spacing w:after="120" w:before="240"/>
+      </w:pPr>
+      <w:r>
+        <w:rPr>
+          <w:rFonts w:ascii="Arial" w:cs="Arial" w:hAnsi="Arial"/>
+          <w:b/>
+          <w:bCs/>
+          <w:color w:val="1E2761"/>
+          <w:sz w:val="26"/>
+          <w:szCs w:val="26"/>
+          <w:rtl/>
+        </w:rPr>
+        <w:t xml:space="preserve">حقول جدول عرض الأسعار</w:t>
+      </w:r>
+    </w:p>
+    <w:tbl>
+      <w:tblPr>
+        <w:bidiVisual/>
+        <w:tblW w:type="dxa" w:w="9026"/>
+        <w:tblBorders>
+          <w:top w:val="single" w:color="auto" w:sz="4"/>
+          <w:left w:val="single" w:color="auto" w:sz="4"/>
+          <w:bottom w:val="single" w:color="auto" w:sz="4"/>
+          <w:right w:val="single" w:color="auto" w:sz="4"/>
+          <w:insideH w:val="single" w:color="auto" w:sz="4"/>
+          <w:insideV w:val="single" w:color="auto" w:sz="4"/>
+        </w:tblBorders>
+      </w:tblPr>
+      <w:tblGrid>
+        <w:gridCol w:w="3800"/>
+        <w:gridCol w:w="5226"/>
+      </w:tblGrid>
+      <w:tr>
+        <w:trPr>
+          <w:tblHeader/>
+        </w:trPr>
+        <w:tc>
+          <w:tcPr>
+            <w:tcW w:type="dxa" w:w="3800"/>
+            <w:tcBorders>
+              <w:top w:val="single" w:color="C9CEDF" w:sz="4"/>
+              <w:left w:val="single" w:color="C9CEDF" w:sz="4"/>
+              <w:bottom w:val="single" w:color="C9CEDF" w:sz="4"/>
+              <w:right w:val="single" w:color="C9CEDF" w:sz="4"/>
+            </w:tcBorders>
+            <w:shd w:fill="1E2761" w:color="auto" w:val="clear"/>
+            <w:tcMar>
+              <w:top w:type="dxa" w:w="70"/>
+              <w:left w:type="dxa" w:w="110"/>
+              <w:bottom w:type="dxa" w:w="70"/>
+              <w:right w:type="dxa" w:w="110"/>
+            </w:tcMar>
+            <w:vAlign w:val="center"/>
+          </w:tcPr>
+          <w:p>
+            <w:pPr>
+              <w:bidi/>
+              <w:spacing w:after="0" w:line="276"/>
+            </w:pPr>
+            <w:r>
+              <w:rPr>
+                <w:rFonts w:ascii="Arial" w:cs="Arial" w:hAnsi="Arial"/>
+                <w:b/>
+                <w:bCs/>
+                <w:color w:val="FFFFFF"/>
+                <w:sz w:val="20"/>
+                <w:szCs w:val="20"/>
+                <w:rtl/>
+              </w:rPr>
+              <w:t xml:space="preserve">العمود</w:t>
+            </w:r>
+          </w:p>
+        </w:tc>
+        <w:tc>
+          <w:tcPr>
+            <w:tcW w:type="dxa" w:w="5226"/>
+            <w:tcBorders>
+              <w:top w:val="single" w:color="C9CEDF" w:sz="4"/>
+              <w:left w:val="single" w:color="C9CEDF" w:sz="4"/>
+              <w:bottom w:val="single" w:color="C9CEDF" w:sz="4"/>
+              <w:right w:val="single" w:color="C9CEDF" w:sz="4"/>
+            </w:tcBorders>
+            <w:shd w:fill="1E2761" w:color="auto" w:val="clear"/>
+            <w:tcMar>
+              <w:top w:type="dxa" w:w="70"/>
+              <w:left w:type="dxa" w:w="110"/>
+              <w:bottom w:type="dxa" w:w="70"/>
+              <w:right w:type="dxa" w:w="110"/>
+            </w:tcMar>
+            <w:vAlign w:val="center"/>
+          </w:tcPr>
+          <w:p>
+            <w:pPr>
+              <w:bidi/>
+              <w:spacing w:after="0" w:line="276"/>
+            </w:pPr>
+            <w:r>
+              <w:rPr>
+                <w:rFonts w:ascii="Arial" w:cs="Arial" w:hAnsi="Arial"/>
+                <w:b/>
+                <w:bCs/>
+                <w:color w:val="FFFFFF"/>
+                <w:sz w:val="20"/>
+                <w:szCs w:val="20"/>
+                <w:rtl/>
+              </w:rPr>
+              <w:t xml:space="preserve">المعنى</w:t>
+            </w:r>
+          </w:p>
+        </w:tc>
+      </w:tr>
+      <w:tr>
+        <w:trPr>
+          <w:cantSplit/>
+        </w:trPr>
+        <w:tc>
+          <w:tcPr>
+            <w:tcW w:type="dxa" w:w="3800"/>
+            <w:tcBorders>
+              <w:top w:val="single" w:color="C9CEDF" w:sz="4"/>
+              <w:left w:val="single" w:color="C9CEDF" w:sz="4"/>
+              <w:bottom w:val="single" w:color="C9CEDF" w:sz="4"/>
+              <w:right w:val="single" w:color="C9CEDF" w:sz="4"/>
+            </w:tcBorders>
+            <w:shd w:fill="FFFFFF" w:color="auto" w:val="clear"/>
+            <w:tcMar>
+              <w:top w:type="dxa" w:w="70"/>
+              <w:left w:type="dxa" w:w="110"/>
+              <w:bottom w:type="dxa" w:w="70"/>
+              <w:right w:type="dxa" w:w="110"/>
+            </w:tcMar>
+            <w:vAlign w:val="center"/>
+          </w:tcPr>
+          <w:p>
+            <w:pPr>
+              <w:bidi/>
+              <w:spacing w:after="0" w:line="276"/>
+            </w:pPr>
+            <w:r>
+              <w:rPr>
+                <w:rFonts w:ascii="Arial" w:cs="Arial" w:hAnsi="Arial"/>
+                <w:b w:val="false"/>
+                <w:sz w:val="20"/>
+                <w:szCs w:val="20"/>
+                <w:rtl/>
+              </w:rPr>
+              <w:t xml:space="preserve">SYMBOL</w:t>
+            </w:r>
+          </w:p>
+        </w:tc>
+        <w:tc>
+          <w:tcPr>
+            <w:tcW w:type="dxa" w:w="5226"/>
+            <w:tcBorders>
+              <w:top w:val="single" w:color="C9CEDF" w:sz="4"/>
+              <w:left w:val="single" w:color="C9CEDF" w:sz="4"/>
+              <w:bottom w:val="single" w:color="C9CEDF" w:sz="4"/>
+              <w:right w:val="single" w:color="C9CEDF" w:sz="4"/>
+            </w:tcBorders>
+            <w:shd w:fill="FFFFFF" w:color="auto" w:val="clear"/>
+            <w:tcMar>
+              <w:top w:type="dxa" w:w="70"/>
+              <w:left w:type="dxa" w:w="110"/>
+              <w:bottom w:type="dxa" w:w="70"/>
+              <w:right w:type="dxa" w:w="110"/>
+            </w:tcMar>
+            <w:vAlign w:val="center"/>
+          </w:tcPr>
+          <w:p>
+            <w:pPr>
+              <w:bidi/>
+              <w:spacing w:after="0" w:line="276"/>
+            </w:pPr>
+            <w:r>
+              <w:rPr>
+                <w:rFonts w:ascii="Arial" w:cs="Arial" w:hAnsi="Arial"/>
+                <w:b w:val="false"/>
+                <w:sz w:val="20"/>
+                <w:szCs w:val="20"/>
+                <w:rtl/>
+              </w:rPr>
+              <w:t xml:space="preserve">رمز الشركة (مطابق للملف المرجعي)</w:t>
+            </w:r>
+          </w:p>
+        </w:tc>
+      </w:tr>
+      <w:tr>
+        <w:trPr>
+          <w:cantSplit/>
+        </w:trPr>
+        <w:tc>
+          <w:tcPr>
+            <w:tcW w:type="dxa" w:w="3800"/>
+            <w:tcBorders>
+              <w:top w:val="single" w:color="C9CEDF" w:sz="4"/>
+              <w:left w:val="single" w:color="C9CEDF" w:sz="4"/>
+              <w:bottom w:val="single" w:color="C9CEDF" w:sz="4"/>
+              <w:right w:val="single" w:color="C9CEDF" w:sz="4"/>
+            </w:tcBorders>
+            <w:shd w:fill="F6F7FB" w:color="auto" w:val="clear"/>
+            <w:tcMar>
+              <w:top w:type="dxa" w:w="70"/>
+              <w:left w:type="dxa" w:w="110"/>
+              <w:bottom w:type="dxa" w:w="70"/>
+              <w:right w:type="dxa" w:w="110"/>
+            </w:tcMar>
+            <w:vAlign w:val="center"/>
+          </w:tcPr>
+          <w:p>
+            <w:pPr>
+              <w:bidi/>
+              <w:spacing w:after="0" w:line="276"/>
+            </w:pPr>
+            <w:r>
+              <w:rPr>
+                <w:rFonts w:ascii="Arial" w:cs="Arial" w:hAnsi="Arial"/>
+                <w:b w:val="false"/>
+                <w:sz w:val="20"/>
+                <w:szCs w:val="20"/>
+                <w:rtl/>
+              </w:rPr>
+              <w:t xml:space="preserve">PREV_CLOSE / OPEN_PRICE</w:t>
+            </w:r>
+          </w:p>
+        </w:tc>
+        <w:tc>
+          <w:tcPr>
+            <w:tcW w:type="dxa" w:w="5226"/>
+            <w:tcBorders>
+              <w:top w:val="single" w:color="C9CEDF" w:sz="4"/>
+              <w:left w:val="single" w:color="C9CEDF" w:sz="4"/>
+              <w:bottom w:val="single" w:color="C9CEDF" w:sz="4"/>
+              <w:right w:val="single" w:color="C9CEDF" w:sz="4"/>
+            </w:tcBorders>
+            <w:shd w:fill="F6F7FB" w:color="auto" w:val="clear"/>
+            <w:tcMar>
+              <w:top w:type="dxa" w:w="70"/>
+              <w:left w:type="dxa" w:w="110"/>
+              <w:bottom w:type="dxa" w:w="70"/>
+              <w:right w:type="dxa" w:w="110"/>
+            </w:tcMar>
+            <w:vAlign w:val="center"/>
+          </w:tcPr>
+          <w:p>
+            <w:pPr>
+              <w:bidi/>
+              <w:spacing w:after="0" w:line="276"/>
+            </w:pPr>
+            <w:r>
+              <w:rPr>
+                <w:rFonts w:ascii="Arial" w:cs="Arial" w:hAnsi="Arial"/>
+                <w:b w:val="false"/>
+                <w:sz w:val="20"/>
+                <w:szCs w:val="20"/>
+                <w:rtl/>
+              </w:rPr>
+              <w:t xml:space="preserve">سعر الإغلاق السابق / سعر الفتح</w:t>
+            </w:r>
+          </w:p>
+        </w:tc>
+      </w:tr>
+      <w:tr>
+        <w:trPr>
+          <w:cantSplit/>
+        </w:trPr>
+        <w:tc>
+          <w:tcPr>
+            <w:tcW w:type="dxa" w:w="3800"/>
+            <w:tcBorders>
+              <w:top w:val="single" w:color="C9CEDF" w:sz="4"/>
+              <w:left w:val="single" w:color="C9CEDF" w:sz="4"/>
+              <w:bottom w:val="single" w:color="C9CEDF" w:sz="4"/>
+              <w:right w:val="single" w:color="C9CEDF" w:sz="4"/>
+            </w:tcBorders>
+            <w:shd w:fill="FFFFFF" w:color="auto" w:val="clear"/>
+            <w:tcMar>
+              <w:top w:type="dxa" w:w="70"/>
+              <w:left w:type="dxa" w:w="110"/>
+              <w:bottom w:type="dxa" w:w="70"/>
+              <w:right w:type="dxa" w:w="110"/>
+            </w:tcMar>
+            <w:vAlign w:val="center"/>
+          </w:tcPr>
+          <w:p>
+            <w:pPr>
+              <w:bidi/>
+              <w:spacing w:after="0" w:line="276"/>
+            </w:pPr>
+            <w:r>
+              <w:rPr>
+                <w:rFonts w:ascii="Arial" w:cs="Arial" w:hAnsi="Arial"/>
+                <w:b w:val="false"/>
+                <w:sz w:val="20"/>
+                <w:szCs w:val="20"/>
+                <w:rtl/>
+              </w:rPr>
+              <w:t xml:space="preserve">HIGH_PRICE / LOW_PRICE / LAST_PRICE</w:t>
+            </w:r>
+          </w:p>
+        </w:tc>
+        <w:tc>
+          <w:tcPr>
+            <w:tcW w:type="dxa" w:w="5226"/>
+            <w:tcBorders>
+              <w:top w:val="single" w:color="C9CEDF" w:sz="4"/>
+              <w:left w:val="single" w:color="C9CEDF" w:sz="4"/>
+              <w:bottom w:val="single" w:color="C9CEDF" w:sz="4"/>
+              <w:right w:val="single" w:color="C9CEDF" w:sz="4"/>
+            </w:tcBorders>
+            <w:shd w:fill="FFFFFF" w:color="auto" w:val="clear"/>
+            <w:tcMar>
+              <w:top w:type="dxa" w:w="70"/>
+              <w:left w:type="dxa" w:w="110"/>
+              <w:bottom w:type="dxa" w:w="70"/>
+              <w:right w:type="dxa" w:w="110"/>
+            </w:tcMar>
+            <w:vAlign w:val="center"/>
+          </w:tcPr>
+          <w:p>
+            <w:pPr>
+              <w:bidi/>
+              <w:spacing w:after="0" w:line="276"/>
+            </w:pPr>
+            <w:r>
+              <w:rPr>
+                <w:rFonts w:ascii="Arial" w:cs="Arial" w:hAnsi="Arial"/>
+                <w:b w:val="false"/>
+                <w:sz w:val="20"/>
+                <w:szCs w:val="20"/>
+                <w:rtl/>
+              </w:rPr>
+              <w:t xml:space="preserve">أعلى سعر / أقل سعر / آخر سعر أو سعر الإغلاق المعتمد</w:t>
+            </w:r>
+          </w:p>
+        </w:tc>
+      </w:tr>
+      <w:tr>
+        <w:trPr>
+          <w:cantSplit/>
+        </w:trPr>
+        <w:tc>
+          <w:tcPr>
+            <w:tcW w:type="dxa" w:w="3800"/>
+            <w:tcBorders>
+              <w:top w:val="single" w:color="C9CEDF" w:sz="4"/>
+              <w:left w:val="single" w:color="C9CEDF" w:sz="4"/>
+              <w:bottom w:val="single" w:color="C9CEDF" w:sz="4"/>
+              <w:right w:val="single" w:color="C9CEDF" w:sz="4"/>
+            </w:tcBorders>
+            <w:shd w:fill="F6F7FB" w:color="auto" w:val="clear"/>
+            <w:tcMar>
+              <w:top w:type="dxa" w:w="70"/>
+              <w:left w:type="dxa" w:w="110"/>
+              <w:bottom w:type="dxa" w:w="70"/>
+              <w:right w:type="dxa" w:w="110"/>
+            </w:tcMar>
+            <w:vAlign w:val="center"/>
+          </w:tcPr>
+          <w:p>
+            <w:pPr>
+              <w:bidi/>
+              <w:spacing w:after="0" w:line="276"/>
+            </w:pPr>
+            <w:r>
+              <w:rPr>
+                <w:rFonts w:ascii="Arial" w:cs="Arial" w:hAnsi="Arial"/>
+                <w:b w:val="false"/>
+                <w:sz w:val="20"/>
+                <w:szCs w:val="20"/>
+                <w:rtl/>
+              </w:rPr>
+              <w:t xml:space="preserve">VOLUME / TRADE_VALUE / TRADES</w:t>
+            </w:r>
+          </w:p>
+        </w:tc>
+        <w:tc>
+          <w:tcPr>
+            <w:tcW w:type="dxa" w:w="5226"/>
+            <w:tcBorders>
+              <w:top w:val="single" w:color="C9CEDF" w:sz="4"/>
+              <w:left w:val="single" w:color="C9CEDF" w:sz="4"/>
+              <w:bottom w:val="single" w:color="C9CEDF" w:sz="4"/>
+              <w:right w:val="single" w:color="C9CEDF" w:sz="4"/>
+            </w:tcBorders>
+            <w:shd w:fill="F6F7FB" w:color="auto" w:val="clear"/>
+            <w:tcMar>
+              <w:top w:type="dxa" w:w="70"/>
+              <w:left w:type="dxa" w:w="110"/>
+              <w:bottom w:type="dxa" w:w="70"/>
+              <w:right w:type="dxa" w:w="110"/>
+            </w:tcMar>
+            <w:vAlign w:val="center"/>
+          </w:tcPr>
+          <w:p>
+            <w:pPr>
+              <w:bidi/>
+              <w:spacing w:after="0" w:line="276"/>
+            </w:pPr>
+            <w:r>
+              <w:rPr>
+                <w:rFonts w:ascii="Arial" w:cs="Arial" w:hAnsi="Arial"/>
+                <w:b w:val="false"/>
+                <w:sz w:val="20"/>
+                <w:szCs w:val="20"/>
+                <w:rtl/>
+              </w:rPr>
+              <w:t xml:space="preserve">كمية التداول / قيمة التداول / عدد العمليات</w:t>
+            </w:r>
+          </w:p>
+        </w:tc>
+      </w:tr>
+      <w:tr>
+        <w:trPr>
+          <w:cantSplit/>
+        </w:trPr>
+        <w:tc>
+          <w:tcPr>
+            <w:tcW w:type="dxa" w:w="3800"/>
+            <w:tcBorders>
+              <w:top w:val="single" w:color="C9CEDF" w:sz="4"/>
+              <w:left w:val="single" w:color="C9CEDF" w:sz="4"/>
+              <w:bottom w:val="single" w:color="C9CEDF" w:sz="4"/>
+              <w:right w:val="single" w:color="C9CEDF" w:sz="4"/>
+            </w:tcBorders>
+            <w:shd w:fill="FFFFFF" w:color="auto" w:val="clear"/>
+            <w:tcMar>
+              <w:top w:type="dxa" w:w="70"/>
+              <w:left w:type="dxa" w:w="110"/>
+              <w:bottom w:type="dxa" w:w="70"/>
+              <w:right w:type="dxa" w:w="110"/>
+            </w:tcMar>
+            <w:vAlign w:val="center"/>
+          </w:tcPr>
+          <w:p>
+            <w:pPr>
+              <w:bidi/>
+              <w:spacing w:after="0" w:line="276"/>
+            </w:pPr>
+            <w:r>
+              <w:rPr>
+                <w:rFonts w:ascii="Arial" w:cs="Arial" w:hAnsi="Arial"/>
+                <w:b w:val="false"/>
+                <w:sz w:val="20"/>
+                <w:szCs w:val="20"/>
+                <w:rtl/>
+              </w:rPr>
+              <w:t xml:space="preserve">BEST_BID / BEST_ASK</w:t>
+            </w:r>
+          </w:p>
+        </w:tc>
+        <w:tc>
+          <w:tcPr>
+            <w:tcW w:type="dxa" w:w="5226"/>
+            <w:tcBorders>
+              <w:top w:val="single" w:color="C9CEDF" w:sz="4"/>
+              <w:left w:val="single" w:color="C9CEDF" w:sz="4"/>
+              <w:bottom w:val="single" w:color="C9CEDF" w:sz="4"/>
+              <w:right w:val="single" w:color="C9CEDF" w:sz="4"/>
+            </w:tcBorders>
+            <w:shd w:fill="FFFFFF" w:color="auto" w:val="clear"/>
+            <w:tcMar>
+              <w:top w:type="dxa" w:w="70"/>
+              <w:left w:type="dxa" w:w="110"/>
+              <w:bottom w:type="dxa" w:w="70"/>
+              <w:right w:type="dxa" w:w="110"/>
+            </w:tcMar>
+            <w:vAlign w:val="center"/>
+          </w:tcPr>
+          <w:p>
+            <w:pPr>
+              <w:bidi/>
+              <w:spacing w:after="0" w:line="276"/>
+            </w:pPr>
+            <w:r>
+              <w:rPr>
+                <w:rFonts w:ascii="Arial" w:cs="Arial" w:hAnsi="Arial"/>
+                <w:b w:val="false"/>
+                <w:sz w:val="20"/>
+                <w:szCs w:val="20"/>
+                <w:rtl/>
+              </w:rPr>
+              <w:t xml:space="preserve">أفضل طلب / أفضل عرض</w:t>
+            </w:r>
+          </w:p>
+        </w:tc>
+      </w:tr>
+      <w:tr>
+        <w:trPr>
+          <w:cantSplit/>
+        </w:trPr>
+        <w:tc>
+          <w:tcPr>
+            <w:tcW w:type="dxa" w:w="3800"/>
+            <w:tcBorders>
+              <w:top w:val="single" w:color="C9CEDF" w:sz="4"/>
+              <w:left w:val="single" w:color="C9CEDF" w:sz="4"/>
+              <w:bottom w:val="single" w:color="C9CEDF" w:sz="4"/>
+              <w:right w:val="single" w:color="C9CEDF" w:sz="4"/>
+            </w:tcBorders>
+            <w:shd w:fill="F6F7FB" w:color="auto" w:val="clear"/>
+            <w:tcMar>
+              <w:top w:type="dxa" w:w="70"/>
+              <w:left w:type="dxa" w:w="110"/>
+              <w:bottom w:type="dxa" w:w="70"/>
+              <w:right w:type="dxa" w:w="110"/>
+            </w:tcMar>
+            <w:vAlign w:val="center"/>
+          </w:tcPr>
+          <w:p>
+            <w:pPr>
+              <w:bidi/>
+              <w:spacing w:after="0" w:line="276"/>
+            </w:pPr>
+            <w:r>
+              <w:rPr>
+                <w:rFonts w:ascii="Arial" w:cs="Arial" w:hAnsi="Arial"/>
+                <w:b w:val="false"/>
+                <w:sz w:val="20"/>
+                <w:szCs w:val="20"/>
+                <w:rtl/>
+              </w:rPr>
+              <w:t xml:space="preserve">SHARES_OUTSTANDING</w:t>
+            </w:r>
+          </w:p>
+        </w:tc>
+        <w:tc>
+          <w:tcPr>
+            <w:tcW w:type="dxa" w:w="5226"/>
+            <w:tcBorders>
+              <w:top w:val="single" w:color="C9CEDF" w:sz="4"/>
+              <w:left w:val="single" w:color="C9CEDF" w:sz="4"/>
+              <w:bottom w:val="single" w:color="C9CEDF" w:sz="4"/>
+              <w:right w:val="single" w:color="C9CEDF" w:sz="4"/>
+            </w:tcBorders>
+            <w:shd w:fill="F6F7FB" w:color="auto" w:val="clear"/>
+            <w:tcMar>
+              <w:top w:type="dxa" w:w="70"/>
+              <w:left w:type="dxa" w:w="110"/>
+              <w:bottom w:type="dxa" w:w="70"/>
+              <w:right w:type="dxa" w:w="110"/>
+            </w:tcMar>
+            <w:vAlign w:val="center"/>
+          </w:tcPr>
+          <w:p>
+            <w:pPr>
+              <w:bidi/>
+              <w:spacing w:after="0" w:line="276"/>
+            </w:pPr>
+            <w:r>
+              <w:rPr>
+                <w:rFonts w:ascii="Arial" w:cs="Arial" w:hAnsi="Arial"/>
+                <w:b w:val="false"/>
+                <w:sz w:val="20"/>
+                <w:szCs w:val="20"/>
+                <w:rtl/>
+              </w:rPr>
+              <w:t xml:space="preserve">عدد الأسهم المصدرة (اختياري)</w:t>
+            </w:r>
+          </w:p>
+        </w:tc>
+      </w:tr>
+    </w:tbl>
+    <w:p>
+      <w:pPr>
+        <w:pStyle w:val="Heading2"/>
+        <w:keepNext/>
+        <w:bidi/>
+        <w:spacing w:after="120" w:before="240"/>
+      </w:pPr>
+      <w:r>
+        <w:rPr>
+          <w:rFonts w:ascii="Arial" w:cs="Arial" w:hAnsi="Arial"/>
+          <w:b/>
+          <w:bCs/>
+          <w:color w:val="1E2761"/>
+          <w:sz w:val="26"/>
+          <w:szCs w:val="26"/>
+          <w:rtl/>
+        </w:rPr>
+        <w:t xml:space="preserve">المطلوب على جهاز الشاشة</w:t>
+      </w:r>
+    </w:p>
+    <w:p>
+      <w:pPr>
+        <w:pStyle w:val="ListParagraph"/>
+        <w:numPr>
+          <w:ilvl w:val="0"/>
+          <w:numId w:val="8"/>
+        </w:numPr>
+        <w:bidi/>
+        <w:spacing w:after="100" w:line="300"/>
+      </w:pPr>
+      <w:r>
+        <w:rPr>
+          <w:rFonts w:ascii="Arial" w:cs="Arial" w:hAnsi="Arial"/>
+          <w:sz w:val="22"/>
+          <w:szCs w:val="22"/>
+          <w:rtl/>
+        </w:rPr>
+        <w:t xml:space="preserve">تثبيت مشغّل القاعدة: </w:t>
+      </w:r>
+      <w:r>
+        <w:rPr>
+          <w:rFonts w:ascii="Arial" w:cs="Arial" w:hAnsi="Arial"/>
+          <w:b/>
+          <w:bCs/>
+          <w:sz w:val="22"/>
+          <w:szCs w:val="22"/>
+          <w:rtl/>
+        </w:rPr>
+        <w:t xml:space="preserve">pip install pyodbc</w:t>
+      </w:r>
+      <w:r>
+        <w:rPr>
+          <w:rFonts w:ascii="Arial" w:cs="Arial" w:hAnsi="Arial"/>
+          <w:sz w:val="22"/>
+          <w:szCs w:val="22"/>
+          <w:rtl/>
+        </w:rPr>
+        <w:t xml:space="preserve"> لـ SQL Server (مع Microsoft ODBC Driver 18) أو </w:t>
+      </w:r>
+      <w:r>
+        <w:rPr>
+          <w:rFonts w:ascii="Arial" w:cs="Arial" w:hAnsi="Arial"/>
+          <w:b/>
+          <w:bCs/>
+          <w:sz w:val="22"/>
+          <w:szCs w:val="22"/>
+          <w:rtl/>
+        </w:rPr>
+        <w:t xml:space="preserve">pip install oracledb</w:t>
+      </w:r>
+      <w:r>
+        <w:rPr>
+          <w:rFonts w:ascii="Arial" w:cs="Arial" w:hAnsi="Arial"/>
+          <w:sz w:val="22"/>
+          <w:szCs w:val="22"/>
+          <w:rtl/>
+        </w:rPr>
+        <w:t xml:space="preserve"> لـ Oracle.</w:t>
+      </w:r>
+    </w:p>
+    <w:p>
+      <w:pPr>
+        <w:pStyle w:val="ListParagraph"/>
+        <w:numPr>
+          <w:ilvl w:val="0"/>
+          <w:numId w:val="8"/>
+        </w:numPr>
+        <w:bidi/>
+        <w:spacing w:after="100" w:line="300"/>
+      </w:pPr>
+      <w:r>
+        <w:rPr>
+          <w:rFonts w:ascii="Arial" w:cs="Arial" w:hAnsi="Arial"/>
+          <w:sz w:val="22"/>
+          <w:szCs w:val="22"/>
+          <w:rtl/>
+        </w:rPr>
+        <w:t xml:space="preserve">تعبئة ملف الإعداد </w:t>
+      </w:r>
+      <w:r>
+        <w:rPr>
+          <w:rFonts w:ascii="Arial" w:cs="Arial" w:hAnsi="Arial"/>
+          <w:b/>
+          <w:bCs/>
+          <w:sz w:val="22"/>
+          <w:szCs w:val="22"/>
+          <w:rtl/>
+        </w:rPr>
+        <w:t xml:space="preserve">tools\db_feeder.ini</w:t>
+      </w:r>
+      <w:r>
+        <w:rPr>
+          <w:rFonts w:ascii="Arial" w:cs="Arial" w:hAnsi="Arial"/>
+          <w:sz w:val="22"/>
+          <w:szCs w:val="22"/>
+          <w:rtl/>
+        </w:rPr>
+        <w:t xml:space="preserve">: نوع القاعدة، العنوان، اسم المستخدم، ومواعيد الجلسة، وعناوين بريد التنبيهات.</w:t>
+      </w:r>
+    </w:p>
+    <w:p>
+      <w:pPr>
+        <w:pStyle w:val="ListParagraph"/>
+        <w:numPr>
+          <w:ilvl w:val="0"/>
+          <w:numId w:val="8"/>
+        </w:numPr>
+        <w:bidi/>
+        <w:spacing w:after="100" w:line="300"/>
+      </w:pPr>
+      <w:r>
+        <w:rPr>
+          <w:rFonts w:ascii="Arial" w:cs="Arial" w:hAnsi="Arial"/>
+          <w:sz w:val="22"/>
+          <w:szCs w:val="22"/>
+          <w:rtl/>
+        </w:rPr>
+        <w:t xml:space="preserve">حفظ كلمة المرور في متغير بيئة على مستوى النظام: setx LSM_DB_PASSWORD "..." /M — ولا تُكتب في الملف.</w:t>
+      </w:r>
+    </w:p>
+    <w:p>
+      <w:pPr>
+        <w:pStyle w:val="ListParagraph"/>
+        <w:numPr>
+          <w:ilvl w:val="0"/>
+          <w:numId w:val="8"/>
+        </w:numPr>
+        <w:bidi/>
+        <w:spacing w:after="100" w:line="300"/>
+      </w:pPr>
+      <w:r>
+        <w:rPr>
+          <w:rFonts w:ascii="Arial" w:cs="Arial" w:hAnsi="Arial"/>
+          <w:sz w:val="22"/>
+          <w:szCs w:val="22"/>
+          <w:rtl/>
+        </w:rPr>
+        <w:t xml:space="preserve">الاختبار: </w:t>
+      </w:r>
+      <w:r>
+        <w:rPr>
+          <w:rFonts w:ascii="Arial" w:cs="Arial" w:hAnsi="Arial"/>
+          <w:b/>
+          <w:bCs/>
+          <w:sz w:val="22"/>
+          <w:szCs w:val="22"/>
+          <w:rtl/>
+        </w:rPr>
+        <w:t xml:space="preserve">test-db-feeder.bat</w:t>
+      </w:r>
+      <w:r>
+        <w:rPr>
+          <w:rFonts w:ascii="Arial" w:cs="Arial" w:hAnsi="Arial"/>
+          <w:sz w:val="22"/>
+          <w:szCs w:val="22"/>
+          <w:rtl/>
+        </w:rPr>
+        <w:t xml:space="preserve"> — يعرض الأعمدة ومطابقتها والنتيجة دون كتابة أي ملف.</w:t>
+      </w:r>
+    </w:p>
+    <w:p>
+      <w:pPr>
+        <w:pStyle w:val="ListParagraph"/>
+        <w:numPr>
+          <w:ilvl w:val="0"/>
+          <w:numId w:val="8"/>
+        </w:numPr>
+        <w:bidi/>
+        <w:spacing w:after="100" w:line="300"/>
+      </w:pPr>
+      <w:r>
+        <w:rPr>
+          <w:rFonts w:ascii="Arial" w:cs="Arial" w:hAnsi="Arial"/>
+          <w:sz w:val="22"/>
+          <w:szCs w:val="22"/>
+          <w:rtl/>
+        </w:rPr>
+        <w:t xml:space="preserve">التشغيل الدائم: </w:t>
+      </w:r>
+      <w:r>
+        <w:rPr>
+          <w:rFonts w:ascii="Arial" w:cs="Arial" w:hAnsi="Arial"/>
+          <w:b/>
+          <w:bCs/>
+          <w:sz w:val="22"/>
+          <w:szCs w:val="22"/>
+          <w:rtl/>
+        </w:rPr>
+        <w:t xml:space="preserve">install-db-feeder-task.bat</w:t>
+      </w:r>
+      <w:r>
+        <w:rPr>
+          <w:rFonts w:ascii="Arial" w:cs="Arial" w:hAnsi="Arial"/>
+          <w:sz w:val="22"/>
+          <w:szCs w:val="22"/>
+          <w:rtl/>
+        </w:rPr>
+        <w:t xml:space="preserve"> (كمسؤول) — مهمة تبدأ مع إقلاع الجهاز قبل تسجيل الدخول.</w:t>
+      </w:r>
+    </w:p>
+    <w:p>
+      <w:pPr>
+        <w:pStyle w:val="ListParagraph"/>
+        <w:numPr>
+          <w:ilvl w:val="0"/>
+          <w:numId w:val="8"/>
+        </w:numPr>
+        <w:bidi/>
+        <w:spacing w:after="100" w:line="300"/>
+      </w:pPr>
+      <w:r>
+        <w:rPr>
+          <w:rFonts w:ascii="Arial" w:cs="Arial" w:hAnsi="Arial"/>
+          <w:sz w:val="22"/>
+          <w:szCs w:val="22"/>
+          <w:rtl/>
+        </w:rPr>
+        <w:t xml:space="preserve">إزالة start-feeder.bat (تغذية التقارير) من بدء التشغيل، أو إبقاؤه احتياطيًا.</w:t>
+      </w:r>
+    </w:p>
+    <w:p>
+      <w:pPr>
+        <w:pBdr>
+          <w:right w:val="single" w:color="C9A961" w:sz="24" w:space="8"/>
+        </w:pBdr>
+        <w:shd w:fill="FBF6EA" w:color="auto" w:val="clear"/>
+        <w:bidi/>
+        <w:spacing w:after="160" w:before="80" w:line="300"/>
+        <w:ind w:left="200" w:right="200"/>
+      </w:pPr>
+      <w:r>
+        <w:rPr>
+          <w:rFonts w:ascii="Arial" w:cs="Arial" w:hAnsi="Arial"/>
+          <w:b/>
+          <w:bCs/>
+          <w:sz w:val="21"/>
+          <w:szCs w:val="21"/>
+          <w:rtl/>
+        </w:rPr>
+        <w:t xml:space="preserve">للتجربة قبل توفر القاعدة الحقيقية</w:t>
+      </w:r>
+      <w:r>
+        <w:rPr>
+          <w:rFonts w:ascii="Arial" w:cs="Arial" w:hAnsi="Arial"/>
+          <w:sz w:val="21"/>
+          <w:szCs w:val="21"/>
+          <w:rtl/>
+        </w:rPr>
+        <w:t xml:space="preserve">: الأمر  python tools\lsm_db_feeder.py --make-demo-db tools\demo.sqlite  ينشئ قاعدة تجريبية بنفس شكل جدول العرض، والإعداد الافتراضي في db_feeder.ini يشير إليها — فيمكن تدريب الفريق على الدورة كاملة.</w:t>
+      </w:r>
+    </w:p>
+    <w:p>
+      <w:pPr>
+        <w:pStyle w:val="Heading2"/>
+        <w:keepNext/>
+        <w:bidi/>
+        <w:spacing w:after="120" w:before="240"/>
+      </w:pPr>
+      <w:r>
+        <w:rPr>
+          <w:rFonts w:ascii="Arial" w:cs="Arial" w:hAnsi="Arial"/>
+          <w:b/>
+          <w:bCs/>
+          <w:color w:val="1E2761"/>
+          <w:sz w:val="26"/>
+          <w:szCs w:val="26"/>
+          <w:rtl/>
+        </w:rPr>
+        <w:t xml:space="preserve">الضوابط الأمنية</w:t>
+      </w:r>
+    </w:p>
+    <w:p>
+      <w:pPr>
+        <w:pStyle w:val="ListParagraph"/>
+        <w:numPr>
+          <w:ilvl w:val="0"/>
+          <w:numId w:val="2"/>
+        </w:numPr>
+        <w:bidi/>
+        <w:spacing w:after="80" w:line="300"/>
+      </w:pPr>
+      <w:r>
+        <w:rPr>
+          <w:rFonts w:ascii="Arial" w:cs="Arial" w:hAnsi="Arial"/>
+          <w:sz w:val="22"/>
+          <w:szCs w:val="22"/>
+          <w:rtl/>
+        </w:rPr>
+        <w:t xml:space="preserve">تُرفض أي تعليمة غير SELECT قبل إرسالها إلى القاعدة، وتُفتح الجلسة بوضع القراءة فقط حيث يدعمه المشغّل.</w:t>
+      </w:r>
+    </w:p>
+    <w:p>
+      <w:pPr>
+        <w:pStyle w:val="ListParagraph"/>
+        <w:numPr>
+          <w:ilvl w:val="0"/>
+          <w:numId w:val="2"/>
+        </w:numPr>
+        <w:bidi/>
+        <w:spacing w:after="80" w:line="300"/>
+      </w:pPr>
+      <w:r>
+        <w:rPr>
+          <w:rFonts w:ascii="Arial" w:cs="Arial" w:hAnsi="Arial"/>
+          <w:sz w:val="22"/>
+          <w:szCs w:val="22"/>
+          <w:rtl/>
+        </w:rPr>
+        <w:t xml:space="preserve">الحساب لا يرى إلا جدولي العرض؛ ولا تُقرأ أي بيانات مستثمرين أو أوامر تفصيلية.</w:t>
+      </w:r>
+    </w:p>
+    <w:p>
+      <w:pPr>
+        <w:pStyle w:val="ListParagraph"/>
+        <w:numPr>
+          <w:ilvl w:val="0"/>
+          <w:numId w:val="2"/>
+        </w:numPr>
+        <w:bidi/>
+        <w:spacing w:after="80" w:line="300"/>
+      </w:pPr>
+      <w:r>
+        <w:rPr>
+          <w:rFonts w:ascii="Arial" w:cs="Arial" w:hAnsi="Arial"/>
+          <w:sz w:val="22"/>
+          <w:szCs w:val="22"/>
+          <w:rtl/>
+        </w:rPr>
+        <w:t xml:space="preserve">الاتصال باتجاه واحد من جهاز الشاشة إلى القاعدة؛ ويُنصح بعزل جهاز الشاشة في شبكة فرعية.</w:t>
+      </w:r>
+    </w:p>
+    <w:p>
+      <w:pPr>
+        <w:pStyle w:val="ListParagraph"/>
+        <w:numPr>
+          <w:ilvl w:val="0"/>
+          <w:numId w:val="2"/>
+        </w:numPr>
+        <w:bidi/>
+        <w:spacing w:after="80" w:line="300"/>
+      </w:pPr>
+      <w:r>
+        <w:rPr>
+          <w:rFonts w:ascii="Arial" w:cs="Arial" w:hAnsi="Arial"/>
+          <w:sz w:val="22"/>
+          <w:szCs w:val="22"/>
+          <w:rtl/>
+        </w:rPr>
+        <w:t xml:space="preserve">ملف الحالة data\feeder_status.json وسجل data\logs\db_feeder.log للمراجعة والتدقيق.</w:t>
+      </w:r>
+    </w:p>
+    <w:p>
+      <w:pPr>
+        <w:pStyle w:val="Heading2"/>
+        <w:keepNext/>
+        <w:bidi/>
+        <w:spacing w:after="120" w:before="240"/>
+      </w:pPr>
+      <w:r>
+        <w:rPr>
+          <w:rFonts w:ascii="Arial" w:cs="Arial" w:hAnsi="Arial"/>
+          <w:b/>
+          <w:bCs/>
+          <w:color w:val="1E2761"/>
+          <w:sz w:val="26"/>
+          <w:szCs w:val="26"/>
+          <w:rtl/>
+        </w:rPr>
+        <w:t xml:space="preserve">ما نحتاجه لإتمام الربط</w:t>
+      </w:r>
+    </w:p>
+    <w:tbl>
+      <w:tblPr>
+        <w:bidiVisual/>
+        <w:tblW w:type="dxa" w:w="9026"/>
+        <w:tblBorders>
+          <w:top w:val="single" w:color="auto" w:sz="4"/>
+          <w:left w:val="single" w:color="auto" w:sz="4"/>
+          <w:bottom w:val="single" w:color="auto" w:sz="4"/>
+          <w:right w:val="single" w:color="auto" w:sz="4"/>
+          <w:insideH w:val="single" w:color="auto" w:sz="4"/>
+          <w:insideV w:val="single" w:color="auto" w:sz="4"/>
+        </w:tblBorders>
+      </w:tblPr>
+      <w:tblGrid>
+        <w:gridCol w:w="5600"/>
+        <w:gridCol w:w="3426"/>
+      </w:tblGrid>
+      <w:tr>
+        <w:trPr>
+          <w:tblHeader/>
+        </w:trPr>
+        <w:tc>
+          <w:tcPr>
+            <w:tcW w:type="dxa" w:w="5600"/>
+            <w:tcBorders>
+              <w:top w:val="single" w:color="C9CEDF" w:sz="4"/>
+              <w:left w:val="single" w:color="C9CEDF" w:sz="4"/>
+              <w:bottom w:val="single" w:color="C9CEDF" w:sz="4"/>
+              <w:right w:val="single" w:color="C9CEDF" w:sz="4"/>
+            </w:tcBorders>
+            <w:shd w:fill="1E2761" w:color="auto" w:val="clear"/>
+            <w:tcMar>
+              <w:top w:type="dxa" w:w="70"/>
+              <w:left w:type="dxa" w:w="110"/>
+              <w:bottom w:type="dxa" w:w="70"/>
+              <w:right w:type="dxa" w:w="110"/>
+            </w:tcMar>
+            <w:vAlign w:val="center"/>
+          </w:tcPr>
+          <w:p>
+            <w:pPr>
+              <w:bidi/>
+              <w:spacing w:after="0" w:line="276"/>
+            </w:pPr>
+            <w:r>
+              <w:rPr>
+                <w:rFonts w:ascii="Arial" w:cs="Arial" w:hAnsi="Arial"/>
+                <w:b/>
+                <w:bCs/>
+                <w:color w:val="FFFFFF"/>
+                <w:sz w:val="20"/>
+                <w:szCs w:val="20"/>
+                <w:rtl/>
+              </w:rPr>
+              <w:t xml:space="preserve">البند</w:t>
+            </w:r>
+          </w:p>
+        </w:tc>
+        <w:tc>
+          <w:tcPr>
+            <w:tcW w:type="dxa" w:w="3426"/>
+            <w:tcBorders>
+              <w:top w:val="single" w:color="C9CEDF" w:sz="4"/>
+              <w:left w:val="single" w:color="C9CEDF" w:sz="4"/>
+              <w:bottom w:val="single" w:color="C9CEDF" w:sz="4"/>
+              <w:right w:val="single" w:color="C9CEDF" w:sz="4"/>
+            </w:tcBorders>
+            <w:shd w:fill="1E2761" w:color="auto" w:val="clear"/>
+            <w:tcMar>
+              <w:top w:type="dxa" w:w="70"/>
+              <w:left w:type="dxa" w:w="110"/>
+              <w:bottom w:type="dxa" w:w="70"/>
+              <w:right w:type="dxa" w:w="110"/>
+            </w:tcMar>
+            <w:vAlign w:val="center"/>
+          </w:tcPr>
+          <w:p>
+            <w:pPr>
+              <w:bidi/>
+              <w:spacing w:after="0" w:line="276"/>
+            </w:pPr>
+            <w:r>
+              <w:rPr>
+                <w:rFonts w:ascii="Arial" w:cs="Arial" w:hAnsi="Arial"/>
+                <w:b/>
+                <w:bCs/>
+                <w:color w:val="FFFFFF"/>
+                <w:sz w:val="20"/>
+                <w:szCs w:val="20"/>
+                <w:rtl/>
+              </w:rPr>
+              <w:t xml:space="preserve">الجهة</w:t>
+            </w:r>
+          </w:p>
+        </w:tc>
+      </w:tr>
+      <w:tr>
+        <w:trPr>
+          <w:cantSplit/>
+        </w:trPr>
+        <w:tc>
+          <w:tcPr>
+            <w:tcW w:type="dxa" w:w="5600"/>
+            <w:tcBorders>
+              <w:top w:val="single" w:color="C9CEDF" w:sz="4"/>
+              <w:left w:val="single" w:color="C9CEDF" w:sz="4"/>
+              <w:bottom w:val="single" w:color="C9CEDF" w:sz="4"/>
+              <w:right w:val="single" w:color="C9CEDF" w:sz="4"/>
+            </w:tcBorders>
+            <w:shd w:fill="FFFFFF" w:color="auto" w:val="clear"/>
+            <w:tcMar>
+              <w:top w:type="dxa" w:w="70"/>
+              <w:left w:type="dxa" w:w="110"/>
+              <w:bottom w:type="dxa" w:w="70"/>
+              <w:right w:type="dxa" w:w="110"/>
+            </w:tcMar>
+            <w:vAlign w:val="center"/>
+          </w:tcPr>
+          <w:p>
+            <w:pPr>
+              <w:bidi/>
+              <w:spacing w:after="0" w:line="276"/>
+            </w:pPr>
+            <w:r>
+              <w:rPr>
+                <w:rFonts w:ascii="Arial" w:cs="Arial" w:hAnsi="Arial"/>
+                <w:b w:val="false"/>
+                <w:sz w:val="20"/>
+                <w:szCs w:val="20"/>
+                <w:rtl/>
+              </w:rPr>
+              <w:t xml:space="preserve">اسم نظام التداول ومورّده، ونوع قاعدة البيانات</w:t>
+            </w:r>
+          </w:p>
+        </w:tc>
+        <w:tc>
+          <w:tcPr>
+            <w:tcW w:type="dxa" w:w="3426"/>
+            <w:tcBorders>
+              <w:top w:val="single" w:color="C9CEDF" w:sz="4"/>
+              <w:left w:val="single" w:color="C9CEDF" w:sz="4"/>
+              <w:bottom w:val="single" w:color="C9CEDF" w:sz="4"/>
+              <w:right w:val="single" w:color="C9CEDF" w:sz="4"/>
+            </w:tcBorders>
+            <w:shd w:fill="FFFFFF" w:color="auto" w:val="clear"/>
+            <w:tcMar>
+              <w:top w:type="dxa" w:w="70"/>
+              <w:left w:type="dxa" w:w="110"/>
+              <w:bottom w:type="dxa" w:w="70"/>
+              <w:right w:type="dxa" w:w="110"/>
+            </w:tcMar>
+            <w:vAlign w:val="center"/>
+          </w:tcPr>
+          <w:p>
+            <w:pPr>
+              <w:bidi/>
+              <w:spacing w:after="0" w:line="276"/>
+            </w:pPr>
+            <w:r>
+              <w:rPr>
+                <w:rFonts w:ascii="Arial" w:cs="Arial" w:hAnsi="Arial"/>
+                <w:b w:val="false"/>
+                <w:sz w:val="20"/>
+                <w:szCs w:val="20"/>
+                <w:rtl/>
+              </w:rPr>
+              <w:t xml:space="preserve">إدارة السوق / تقنية المعلومات</w:t>
+            </w:r>
+          </w:p>
+        </w:tc>
+      </w:tr>
+      <w:tr>
+        <w:trPr>
+          <w:cantSplit/>
+        </w:trPr>
+        <w:tc>
+          <w:tcPr>
+            <w:tcW w:type="dxa" w:w="5600"/>
+            <w:tcBorders>
+              <w:top w:val="single" w:color="C9CEDF" w:sz="4"/>
+              <w:left w:val="single" w:color="C9CEDF" w:sz="4"/>
+              <w:bottom w:val="single" w:color="C9CEDF" w:sz="4"/>
+              <w:right w:val="single" w:color="C9CEDF" w:sz="4"/>
+            </w:tcBorders>
+            <w:shd w:fill="F6F7FB" w:color="auto" w:val="clear"/>
+            <w:tcMar>
+              <w:top w:type="dxa" w:w="70"/>
+              <w:left w:type="dxa" w:w="110"/>
+              <w:bottom w:type="dxa" w:w="70"/>
+              <w:right w:type="dxa" w:w="110"/>
+            </w:tcMar>
+            <w:vAlign w:val="center"/>
+          </w:tcPr>
+          <w:p>
+            <w:pPr>
+              <w:bidi/>
+              <w:spacing w:after="0" w:line="276"/>
+            </w:pPr>
+            <w:r>
+              <w:rPr>
+                <w:rFonts w:ascii="Arial" w:cs="Arial" w:hAnsi="Arial"/>
+                <w:b w:val="false"/>
+                <w:sz w:val="20"/>
+                <w:szCs w:val="20"/>
+                <w:rtl/>
+              </w:rPr>
+              <w:t xml:space="preserve">تنفيذ قالب جدولي العرض وحساب القراءة فقط</w:t>
+            </w:r>
+          </w:p>
+        </w:tc>
+        <w:tc>
+          <w:tcPr>
+            <w:tcW w:type="dxa" w:w="3426"/>
+            <w:tcBorders>
+              <w:top w:val="single" w:color="C9CEDF" w:sz="4"/>
+              <w:left w:val="single" w:color="C9CEDF" w:sz="4"/>
+              <w:bottom w:val="single" w:color="C9CEDF" w:sz="4"/>
+              <w:right w:val="single" w:color="C9CEDF" w:sz="4"/>
+            </w:tcBorders>
+            <w:shd w:fill="F6F7FB" w:color="auto" w:val="clear"/>
+            <w:tcMar>
+              <w:top w:type="dxa" w:w="70"/>
+              <w:left w:type="dxa" w:w="110"/>
+              <w:bottom w:type="dxa" w:w="70"/>
+              <w:right w:type="dxa" w:w="110"/>
+            </w:tcMar>
+            <w:vAlign w:val="center"/>
+          </w:tcPr>
+          <w:p>
+            <w:pPr>
+              <w:bidi/>
+              <w:spacing w:after="0" w:line="276"/>
+            </w:pPr>
+            <w:r>
+              <w:rPr>
+                <w:rFonts w:ascii="Arial" w:cs="Arial" w:hAnsi="Arial"/>
+                <w:b w:val="false"/>
+                <w:sz w:val="20"/>
+                <w:szCs w:val="20"/>
+                <w:rtl/>
+              </w:rPr>
+              <w:t xml:space="preserve">مسؤول قاعدة البيانات أو المورّد</w:t>
+            </w:r>
+          </w:p>
+        </w:tc>
+      </w:tr>
+      <w:tr>
+        <w:trPr>
+          <w:cantSplit/>
+        </w:trPr>
+        <w:tc>
+          <w:tcPr>
+            <w:tcW w:type="dxa" w:w="5600"/>
+            <w:tcBorders>
+              <w:top w:val="single" w:color="C9CEDF" w:sz="4"/>
+              <w:left w:val="single" w:color="C9CEDF" w:sz="4"/>
+              <w:bottom w:val="single" w:color="C9CEDF" w:sz="4"/>
+              <w:right w:val="single" w:color="C9CEDF" w:sz="4"/>
+            </w:tcBorders>
+            <w:shd w:fill="FFFFFF" w:color="auto" w:val="clear"/>
+            <w:tcMar>
+              <w:top w:type="dxa" w:w="70"/>
+              <w:left w:type="dxa" w:w="110"/>
+              <w:bottom w:type="dxa" w:w="70"/>
+              <w:right w:type="dxa" w:w="110"/>
+            </w:tcMar>
+            <w:vAlign w:val="center"/>
+          </w:tcPr>
+          <w:p>
+            <w:pPr>
+              <w:bidi/>
+              <w:spacing w:after="0" w:line="276"/>
+            </w:pPr>
+            <w:r>
+              <w:rPr>
+                <w:rFonts w:ascii="Arial" w:cs="Arial" w:hAnsi="Arial"/>
+                <w:b w:val="false"/>
+                <w:sz w:val="20"/>
+                <w:szCs w:val="20"/>
+                <w:rtl/>
+              </w:rPr>
+              <w:t xml:space="preserve">فتح منفذ القاعدة من جهاز الشاشة</w:t>
+            </w:r>
+          </w:p>
+        </w:tc>
+        <w:tc>
+          <w:tcPr>
+            <w:tcW w:type="dxa" w:w="3426"/>
+            <w:tcBorders>
+              <w:top w:val="single" w:color="C9CEDF" w:sz="4"/>
+              <w:left w:val="single" w:color="C9CEDF" w:sz="4"/>
+              <w:bottom w:val="single" w:color="C9CEDF" w:sz="4"/>
+              <w:right w:val="single" w:color="C9CEDF" w:sz="4"/>
+            </w:tcBorders>
+            <w:shd w:fill="FFFFFF" w:color="auto" w:val="clear"/>
+            <w:tcMar>
+              <w:top w:type="dxa" w:w="70"/>
+              <w:left w:type="dxa" w:w="110"/>
+              <w:bottom w:type="dxa" w:w="70"/>
+              <w:right w:type="dxa" w:w="110"/>
+            </w:tcMar>
+            <w:vAlign w:val="center"/>
+          </w:tcPr>
+          <w:p>
+            <w:pPr>
+              <w:bidi/>
+              <w:spacing w:after="0" w:line="276"/>
+            </w:pPr>
+            <w:r>
+              <w:rPr>
+                <w:rFonts w:ascii="Arial" w:cs="Arial" w:hAnsi="Arial"/>
+                <w:b w:val="false"/>
+                <w:sz w:val="20"/>
+                <w:szCs w:val="20"/>
+                <w:rtl/>
+              </w:rPr>
+              <w:t xml:space="preserve">الشبكات وأمن المعلومات</w:t>
+            </w:r>
+          </w:p>
+        </w:tc>
+      </w:tr>
+      <w:tr>
+        <w:trPr>
+          <w:cantSplit/>
+        </w:trPr>
+        <w:tc>
+          <w:tcPr>
+            <w:tcW w:type="dxa" w:w="5600"/>
+            <w:tcBorders>
+              <w:top w:val="single" w:color="C9CEDF" w:sz="4"/>
+              <w:left w:val="single" w:color="C9CEDF" w:sz="4"/>
+              <w:bottom w:val="single" w:color="C9CEDF" w:sz="4"/>
+              <w:right w:val="single" w:color="C9CEDF" w:sz="4"/>
+            </w:tcBorders>
+            <w:shd w:fill="F6F7FB" w:color="auto" w:val="clear"/>
+            <w:tcMar>
+              <w:top w:type="dxa" w:w="70"/>
+              <w:left w:type="dxa" w:w="110"/>
+              <w:bottom w:type="dxa" w:w="70"/>
+              <w:right w:type="dxa" w:w="110"/>
+            </w:tcMar>
+            <w:vAlign w:val="center"/>
+          </w:tcPr>
+          <w:p>
+            <w:pPr>
+              <w:bidi/>
+              <w:spacing w:after="0" w:line="276"/>
+            </w:pPr>
+            <w:r>
+              <w:rPr>
+                <w:rFonts w:ascii="Arial" w:cs="Arial" w:hAnsi="Arial"/>
+                <w:b w:val="false"/>
+                <w:sz w:val="20"/>
+                <w:szCs w:val="20"/>
+                <w:rtl/>
+              </w:rPr>
+              <w:t xml:space="preserve">خادم بريد داخلي (SMTP) وعناوين المستلمين للتنبيهات</w:t>
+            </w:r>
+          </w:p>
+        </w:tc>
+        <w:tc>
+          <w:tcPr>
+            <w:tcW w:type="dxa" w:w="3426"/>
+            <w:tcBorders>
+              <w:top w:val="single" w:color="C9CEDF" w:sz="4"/>
+              <w:left w:val="single" w:color="C9CEDF" w:sz="4"/>
+              <w:bottom w:val="single" w:color="C9CEDF" w:sz="4"/>
+              <w:right w:val="single" w:color="C9CEDF" w:sz="4"/>
+            </w:tcBorders>
+            <w:shd w:fill="F6F7FB" w:color="auto" w:val="clear"/>
+            <w:tcMar>
+              <w:top w:type="dxa" w:w="70"/>
+              <w:left w:type="dxa" w:w="110"/>
+              <w:bottom w:type="dxa" w:w="70"/>
+              <w:right w:type="dxa" w:w="110"/>
+            </w:tcMar>
+            <w:vAlign w:val="center"/>
+          </w:tcPr>
+          <w:p>
+            <w:pPr>
+              <w:bidi/>
+              <w:spacing w:after="0" w:line="276"/>
+            </w:pPr>
+            <w:r>
+              <w:rPr>
+                <w:rFonts w:ascii="Arial" w:cs="Arial" w:hAnsi="Arial"/>
+                <w:b w:val="false"/>
+                <w:sz w:val="20"/>
+                <w:szCs w:val="20"/>
+                <w:rtl/>
+              </w:rPr>
+              <w:t xml:space="preserve">تقنية المعلومات</w:t>
+            </w:r>
+          </w:p>
+        </w:tc>
+      </w:tr>
+      <w:tr>
+        <w:trPr>
+          <w:cantSplit/>
+        </w:trPr>
+        <w:tc>
+          <w:tcPr>
+            <w:tcW w:type="dxa" w:w="5600"/>
+            <w:tcBorders>
+              <w:top w:val="single" w:color="C9CEDF" w:sz="4"/>
+              <w:left w:val="single" w:color="C9CEDF" w:sz="4"/>
+              <w:bottom w:val="single" w:color="C9CEDF" w:sz="4"/>
+              <w:right w:val="single" w:color="C9CEDF" w:sz="4"/>
+            </w:tcBorders>
+            <w:shd w:fill="FFFFFF" w:color="auto" w:val="clear"/>
+            <w:tcMar>
+              <w:top w:type="dxa" w:w="70"/>
+              <w:left w:type="dxa" w:w="110"/>
+              <w:bottom w:type="dxa" w:w="70"/>
+              <w:right w:type="dxa" w:w="110"/>
+            </w:tcMar>
+            <w:vAlign w:val="center"/>
+          </w:tcPr>
+          <w:p>
+            <w:pPr>
+              <w:bidi/>
+              <w:spacing w:after="0" w:line="276"/>
+            </w:pPr>
+            <w:r>
+              <w:rPr>
+                <w:rFonts w:ascii="Arial" w:cs="Arial" w:hAnsi="Arial"/>
+                <w:b w:val="false"/>
+                <w:sz w:val="20"/>
+                <w:szCs w:val="20"/>
+                <w:rtl/>
+              </w:rPr>
+              <w:t xml:space="preserve">التقويم الرسمي للعطلات (الأعياد الدينية بتواريخها)</w:t>
+            </w:r>
+          </w:p>
+        </w:tc>
+        <w:tc>
+          <w:tcPr>
+            <w:tcW w:type="dxa" w:w="3426"/>
+            <w:tcBorders>
+              <w:top w:val="single" w:color="C9CEDF" w:sz="4"/>
+              <w:left w:val="single" w:color="C9CEDF" w:sz="4"/>
+              <w:bottom w:val="single" w:color="C9CEDF" w:sz="4"/>
+              <w:right w:val="single" w:color="C9CEDF" w:sz="4"/>
+            </w:tcBorders>
+            <w:shd w:fill="FFFFFF" w:color="auto" w:val="clear"/>
+            <w:tcMar>
+              <w:top w:type="dxa" w:w="70"/>
+              <w:left w:type="dxa" w:w="110"/>
+              <w:bottom w:type="dxa" w:w="70"/>
+              <w:right w:type="dxa" w:w="110"/>
+            </w:tcMar>
+            <w:vAlign w:val="center"/>
+          </w:tcPr>
+          <w:p>
+            <w:pPr>
+              <w:bidi/>
+              <w:spacing w:after="0" w:line="276"/>
+            </w:pPr>
+            <w:r>
+              <w:rPr>
+                <w:rFonts w:ascii="Arial" w:cs="Arial" w:hAnsi="Arial"/>
+                <w:b w:val="false"/>
+                <w:sz w:val="20"/>
+                <w:szCs w:val="20"/>
+                <w:rtl/>
+              </w:rPr>
+              <w:t xml:space="preserve">إدارة السوق</w:t>
+            </w:r>
+          </w:p>
+        </w:tc>
+      </w:tr>
+    </w:tbl>
     <w:sectPr>
       <w:headerReference w:type="default" r:id="rId7"/>
       <w:footerReference w:type="default" r:id="rId8"/>
@@ -14956,6 +17176,74 @@
       </w:rPr>
     </w:lvl>
   </w:abstractNum>
+  <w:abstractNum w:abstractNumId="15" w15:restartNumberingAfterBreak="0">
+    <w:multiLevelType w:val="hybridMultilevel"/>
+    <w:lvl w:ilvl="0" w15:tentative="1">
+      <w:start w:val="1"/>
+      <w:numFmt w:val="decimal"/>
+      <w:lvlText w:val="%1."/>
+      <w:lvlJc w:val="right"/>
+      <w:pPr>
+        <w:ind w:left="560" w:hanging="360"/>
+      </w:pPr>
+      <w:rPr>
+        <w:b/>
+        <w:bCs/>
+        <w:color w:val="1E2761"/>
+      </w:rPr>
+    </w:lvl>
+  </w:abstractNum>
+  <w:abstractNum w:abstractNumId="16" w15:restartNumberingAfterBreak="0">
+    <w:multiLevelType w:val="hybridMultilevel"/>
+    <w:lvl w:ilvl="0" w15:tentative="1">
+      <w:start w:val="1"/>
+      <w:numFmt w:val="decimal"/>
+      <w:lvlText w:val="%1."/>
+      <w:lvlJc w:val="right"/>
+      <w:pPr>
+        <w:ind w:left="560" w:hanging="360"/>
+      </w:pPr>
+      <w:rPr>
+        <w:b/>
+        <w:bCs/>
+        <w:color w:val="1E2761"/>
+      </w:rPr>
+    </w:lvl>
+  </w:abstractNum>
+  <w:abstractNum w:abstractNumId="17" w15:restartNumberingAfterBreak="0">
+    <w:multiLevelType w:val="hybridMultilevel"/>
+    <w:lvl w:ilvl="0" w15:tentative="1">
+      <w:start w:val="1"/>
+      <w:numFmt w:val="decimal"/>
+      <w:lvlText w:val="%1."/>
+      <w:lvlJc w:val="right"/>
+      <w:pPr>
+        <w:ind w:left="560" w:hanging="360"/>
+      </w:pPr>
+      <w:rPr>
+        <w:b/>
+        <w:bCs/>
+        <w:color w:val="1E2761"/>
+      </w:rPr>
+    </w:lvl>
+  </w:abstractNum>
+  <w:abstractNum w:abstractNumId="18" w15:restartNumberingAfterBreak="0">
+    <w:multiLevelType w:val="hybridMultilevel"/>
+    <w:lvl w:ilvl="0" w15:tentative="1">
+      <w:start w:val="1"/>
+      <w:numFmt w:val="decimal"/>
+      <w:lvlText w:val="%1."/>
+      <w:lvlJc w:val="right"/>
+      <w:pPr>
+        <w:ind w:left="560" w:hanging="360"/>
+      </w:pPr>
+      <w:rPr>
+        <w:b/>
+        <w:bCs/>
+        <w:color w:val="1E2761"/>
+      </w:rPr>
+    </w:lvl>
+  </w:abstractNum>
   <w:num w:numId="1">
     <w:abstractNumId w:val="1"/>
     <w:lvlOverride w:ilvl="0">
@@ -14988,6 +17276,18 @@
   </w:num>
   <w:num w:numId="6">
     <w:abstractNumId w:val="6"/>
+    <w:lvlOverride w:ilvl="0">
+      <w:startOverride w:val="1"/>
+    </w:lvlOverride>
+  </w:num>
+  <w:num w:numId="7">
+    <w:abstractNumId w:val="7"/>
+    <w:lvlOverride w:ilvl="0">
+      <w:startOverride w:val="1"/>
+    </w:lvlOverride>
+  </w:num>
+  <w:num w:numId="8">
+    <w:abstractNumId w:val="8"/>
     <w:lvlOverride w:ilvl="0">
       <w:startOverride w:val="1"/>
     </w:lvlOverride>

</xml_diff>